<commit_message>
Documenta el despliegue en Render y actualiza documentos de entrega con la URL
</commit_message>
<xml_diff>
--- a/docs/Evidencias-Edificio-Servlets-JSP.docx
+++ b/docs/Evidencias-Edificio-Servlets-JSP.docx
@@ -167,7 +167,7 @@
         <w:t xml:space="preserve">Aplicación desplegada: </w:t>
       </w:r>
       <w:r>
-        <w:t xml:space="preserve">(pendiente de publicar)</w:t>
+        <w:t xml:space="preserve">https://edificios-servlets-jsp.onrender.com</w:t>
       </w:r>
     </w:p>
     <w:p>
@@ -1842,7 +1842,7 @@
         <w:spacing w:after="120"/>
       </w:pPr>
       <w:r>
-        <w:t xml:space="preserve">El repositorio tiene 22 commits hechos a medida que se construía el proyecto.</w:t>
+        <w:t xml:space="preserve">El repositorio tiene 26 commits hechos a medida que se construía el proyecto.</w:t>
       </w:r>
     </w:p>
     <w:p>
@@ -2129,6 +2129,58 @@
           <w:szCs w:val="18"/>
         </w:rPr>
         <w:t xml:space="preserve">d707e58  2026-09-20  Corrige la codificación UTF-8 de los fragmentos JSPF y amplía el ancho de las tablas</w:t>
+      </w:r>
+    </w:p>
+    <w:p>
+      <w:pPr>
+        <w:spacing w:after="60"/>
+      </w:pPr>
+      <w:r>
+        <w:rPr>
+          <w:rFonts w:ascii="Consolas" w:cs="Consolas" w:eastAsia="Consolas" w:hAnsi="Consolas"/>
+          <w:sz w:val="18"/>
+          <w:szCs w:val="18"/>
+        </w:rPr>
+        <w:t xml:space="preserve">d52bae1  2026-09-20  Agrega capturas de la aplicación y de código con resaltado de sintaxis</w:t>
+      </w:r>
+    </w:p>
+    <w:p>
+      <w:pPr>
+        <w:spacing w:after="60"/>
+      </w:pPr>
+      <w:r>
+        <w:rPr>
+          <w:rFonts w:ascii="Consolas" w:cs="Consolas" w:eastAsia="Consolas" w:hAnsi="Consolas"/>
+          <w:sz w:val="18"/>
+          <w:szCs w:val="18"/>
+        </w:rPr>
+        <w:t xml:space="preserve">223ba1c  2026-09-20  Agrega scripts para generar capturas y documentos de entrega</w:t>
+      </w:r>
+    </w:p>
+    <w:p>
+      <w:pPr>
+        <w:spacing w:after="60"/>
+      </w:pPr>
+      <w:r>
+        <w:rPr>
+          <w:rFonts w:ascii="Consolas" w:cs="Consolas" w:eastAsia="Consolas" w:hAnsi="Consolas"/>
+          <w:sz w:val="18"/>
+          <w:szCs w:val="18"/>
+        </w:rPr>
+        <w:t xml:space="preserve">df8ec55  2026-09-20  Agrega guion de sustentación, guía de estudio y lista de verificación</w:t>
+      </w:r>
+    </w:p>
+    <w:p>
+      <w:pPr>
+        <w:spacing w:after="60"/>
+      </w:pPr>
+      <w:r>
+        <w:rPr>
+          <w:rFonts w:ascii="Consolas" w:cs="Consolas" w:eastAsia="Consolas" w:hAnsi="Consolas"/>
+          <w:sz w:val="18"/>
+          <w:szCs w:val="18"/>
+        </w:rPr>
+        <w:t xml:space="preserve">6383d5b  2026-09-20  Agrega documento de evidencias en Word y ficha de entrega en PDF</w:t>
       </w:r>
     </w:p>
     <w:sectPr>

</xml_diff>

<commit_message>
Actualiza README, guías y documentos para la recuperación por token
</commit_message>
<xml_diff>
--- a/docs/Evidencias-Edificio-Servlets-JSP.docx
+++ b/docs/Evidencias-Edificio-Servlets-JSP.docx
@@ -1642,7 +1642,7 @@
         <w:spacing w:after="120"/>
       </w:pPr>
       <w:r>
-        <w:t xml:space="preserve">El usuario escribe su correo; AuthService genera una clave temporal aleatoria (SecureRandom), la envía por SMTP con Jakarta Mail y guarda su hash BCrypt. La respuesta es la misma exista o no el correo.</w:t>
+        <w:t xml:space="preserve">El usuario escribe su correo; AuthService genera un token aleatorio de 256 bits (SecureRandom), guarda solo su hash SHA-256 (tabla token_recuperacion, vigencia de 30 minutos) y CorreoService envía por correo el enlace de restablecimiento (API de Brevo o SMTP). El token sirve una sola vez; la nueva clave se guarda con BCrypt. La respuesta es la misma exista o no el correo.</w:t>
       </w:r>
     </w:p>
     <w:p>
@@ -1842,7 +1842,7 @@
         <w:spacing w:after="120"/>
       </w:pPr>
       <w:r>
-        <w:t xml:space="preserve">El repositorio tiene 26 commits hechos a medida que se construía el proyecto.</w:t>
+        <w:t xml:space="preserve">El repositorio tiene 28 commits hechos a medida que se construía el proyecto.</w:t>
       </w:r>
     </w:p>
     <w:p>
@@ -2181,6 +2181,32 @@
           <w:szCs w:val="18"/>
         </w:rPr>
         <w:t xml:space="preserve">6383d5b  2026-09-20  Agrega documento de evidencias en Word y ficha de entrega en PDF</w:t>
+      </w:r>
+    </w:p>
+    <w:p>
+      <w:pPr>
+        <w:spacing w:after="60"/>
+      </w:pPr>
+      <w:r>
+        <w:rPr>
+          <w:rFonts w:ascii="Consolas" w:cs="Consolas" w:eastAsia="Consolas" w:hAnsi="Consolas"/>
+          <w:sz w:val="18"/>
+          <w:szCs w:val="18"/>
+        </w:rPr>
+        <w:t xml:space="preserve">b541d5f  2026-09-20  Documenta el despliegue en Render y actualiza documentos de entrega con la URL</w:t>
+      </w:r>
+    </w:p>
+    <w:p>
+      <w:pPr>
+        <w:spacing w:after="60"/>
+      </w:pPr>
+      <w:r>
+        <w:rPr>
+          <w:rFonts w:ascii="Consolas" w:cs="Consolas" w:eastAsia="Consolas" w:hAnsi="Consolas"/>
+          <w:sz w:val="18"/>
+          <w:szCs w:val="18"/>
+        </w:rPr>
+        <w:t xml:space="preserve">3d40b07  2026-09-20  Actualiza la lista de pendientes</w:t>
       </w:r>
     </w:p>
     <w:sectPr>

</xml_diff>

<commit_message>
Regenera el documento de evidencias y la ficha con la recuperación por token
</commit_message>
<xml_diff>
--- a/docs/Evidencias-Edificio-Servlets-JSP.docx
+++ b/docs/Evidencias-Edificio-Servlets-JSP.docx
@@ -1842,7 +1842,7 @@
         <w:spacing w:after="120"/>
       </w:pPr>
       <w:r>
-        <w:t xml:space="preserve">El repositorio tiene 28 commits hechos a medida que se construía el proyecto.</w:t>
+        <w:t xml:space="preserve">El repositorio tiene 31 commits hechos a medida que se construía el proyecto.</w:t>
       </w:r>
     </w:p>
     <w:p>
@@ -2207,6 +2207,45 @@
           <w:szCs w:val="18"/>
         </w:rPr>
         <w:t xml:space="preserve">3d40b07  2026-09-20  Actualiza la lista de pendientes</w:t>
+      </w:r>
+    </w:p>
+    <w:p>
+      <w:pPr>
+        <w:spacing w:after="60"/>
+      </w:pPr>
+      <w:r>
+        <w:rPr>
+          <w:rFonts w:ascii="Consolas" w:cs="Consolas" w:eastAsia="Consolas" w:hAnsi="Consolas"/>
+          <w:sz w:val="18"/>
+          <w:szCs w:val="18"/>
+        </w:rPr>
+        <w:t xml:space="preserve">c9dc095  2026-09-20  Agrega TokenDAO y tabla de tokens de recuperación con hash SHA-256</w:t>
+      </w:r>
+    </w:p>
+    <w:p>
+      <w:pPr>
+        <w:spacing w:after="60"/>
+      </w:pPr>
+      <w:r>
+        <w:rPr>
+          <w:rFonts w:ascii="Consolas" w:cs="Consolas" w:eastAsia="Consolas" w:hAnsi="Consolas"/>
+          <w:sz w:val="18"/>
+          <w:szCs w:val="18"/>
+        </w:rPr>
+        <w:t xml:space="preserve">d112b49  2026-09-20  Recuperación de clave con enlace de token de un solo uso y envío por la API de Brevo, SMTP o log</w:t>
+      </w:r>
+    </w:p>
+    <w:p>
+      <w:pPr>
+        <w:spacing w:after="60"/>
+      </w:pPr>
+      <w:r>
+        <w:rPr>
+          <w:rFonts w:ascii="Consolas" w:cs="Consolas" w:eastAsia="Consolas" w:hAnsi="Consolas"/>
+          <w:sz w:val="18"/>
+          <w:szCs w:val="18"/>
+        </w:rPr>
+        <w:t xml:space="preserve">447d88b  2026-09-20  Actualiza README, guías y documentos para la recuperación por token</w:t>
       </w:r>
     </w:p>
     <w:sectPr>

</xml_diff>

<commit_message>
Regenera el documento de evidencias con la sección de usuarios de prueba
</commit_message>
<xml_diff>
--- a/docs/Evidencias-Edificio-Servlets-JSP.docx
+++ b/docs/Evidencias-Edificio-Servlets-JSP.docx
@@ -168,6 +168,72 @@
       </w:r>
       <w:r>
         <w:t xml:space="preserve">https://edificios-servlets-jsp.onrender.com</w:t>
+      </w:r>
+    </w:p>
+    <w:p>
+      <w:r>
+        <w:br w:type="page"/>
+      </w:r>
+    </w:p>
+    <w:p>
+      <w:pPr>
+        <w:pStyle w:val="Heading1"/>
+        <w:spacing w:after="120" w:before="240"/>
+      </w:pPr>
+      <w:r>
+        <w:t xml:space="preserve">Acceso a la aplicación y usuarios de prueba</w:t>
+      </w:r>
+    </w:p>
+    <w:p>
+      <w:pPr>
+        <w:spacing w:after="120"/>
+      </w:pPr>
+      <w:r>
+        <w:t xml:space="preserve">La aplicación desplegada está en la dirección indicada en la portada. Nota: el servicio gratuito se duerme tras un rato sin uso, por lo que la primera carga puede tardar cerca de 50 segundos.</w:t>
+      </w:r>
+    </w:p>
+    <w:p>
+      <w:pPr>
+        <w:pStyle w:val="ListParagraph"/>
+        <w:numPr>
+          <w:ilvl w:val="0"/>
+          <w:numId w:val="1"/>
+        </w:numPr>
+      </w:pPr>
+      <w:r>
+        <w:t xml:space="preserve">admin@edificios.com · clave Admin123 · rol ADMIN: gestiona edificios y usuarios, y ve todos los reportes.</w:t>
+      </w:r>
+    </w:p>
+    <w:p>
+      <w:pPr>
+        <w:pStyle w:val="ListParagraph"/>
+        <w:numPr>
+          <w:ilvl w:val="0"/>
+          <w:numId w:val="1"/>
+        </w:numPr>
+      </w:pPr>
+      <w:r>
+        <w:t xml:space="preserve">operador@edificios.com · clave Operador123 · rol OPERADOR: gestiona edificios.</w:t>
+      </w:r>
+    </w:p>
+    <w:p>
+      <w:pPr>
+        <w:pStyle w:val="ListParagraph"/>
+        <w:numPr>
+          <w:ilvl w:val="0"/>
+          <w:numId w:val="1"/>
+        </w:numPr>
+      </w:pPr>
+      <w:r>
+        <w:t xml:space="preserve">consulta@edificios.com · clave Consulta123 · rol CONSULTA: solo lectura.</w:t>
+      </w:r>
+    </w:p>
+    <w:p>
+      <w:pPr>
+        <w:spacing w:after="120"/>
+      </w:pPr>
+      <w:r>
+        <w:t xml:space="preserve">El correo es el identificador (id) del usuario. Para probar la recuperación de clave se usa la opción «¿Olvidaste tu clave?» del login con un correo registrado: el sistema envía un enlace con token (vigente 30 minutos y de un solo uso).</w:t>
       </w:r>
     </w:p>
     <w:p>
@@ -1842,7 +1908,7 @@
         <w:spacing w:after="120"/>
       </w:pPr>
       <w:r>
-        <w:t xml:space="preserve">El repositorio tiene 31 commits hechos a medida que se construía el proyecto.</w:t>
+        <w:t xml:space="preserve">El repositorio tiene 33 commits hechos a medida que se construía el proyecto.</w:t>
       </w:r>
     </w:p>
     <w:p>
@@ -2246,6 +2312,32 @@
           <w:szCs w:val="18"/>
         </w:rPr>
         <w:t xml:space="preserve">447d88b  2026-09-20  Actualiza README, guías y documentos para la recuperación por token</w:t>
+      </w:r>
+    </w:p>
+    <w:p>
+      <w:pPr>
+        <w:spacing w:after="60"/>
+      </w:pPr>
+      <w:r>
+        <w:rPr>
+          <w:rFonts w:ascii="Consolas" w:cs="Consolas" w:eastAsia="Consolas" w:hAnsi="Consolas"/>
+          <w:sz w:val="18"/>
+          <w:szCs w:val="18"/>
+        </w:rPr>
+        <w:t xml:space="preserve">835003d  2026-09-20  Regenera el documento de evidencias y la ficha con la recuperación por token</w:t>
+      </w:r>
+    </w:p>
+    <w:p>
+      <w:pPr>
+        <w:spacing w:after="60"/>
+      </w:pPr>
+      <w:r>
+        <w:rPr>
+          <w:rFonts w:ascii="Consolas" w:cs="Consolas" w:eastAsia="Consolas" w:hAnsi="Consolas"/>
+          <w:sz w:val="18"/>
+          <w:szCs w:val="18"/>
+        </w:rPr>
+        <w:t xml:space="preserve">7eb94b1  2026-09-20  Agrega al documento de evidencias la sección de acceso y usuarios de prueba</w:t>
       </w:r>
     </w:p>
     <w:sectPr>

</xml_diff>